<commit_message>
feat: Schreiben-Feinschliff — Adressfeld ohne Herrn/Frau, BV-Briefkopf, Mitteilungs-Anrede
- Adressfeld nur Name (empf_anrede_zeile aus allen 3 Vorlagen + schreiben.ts raus)
- Datum "Ort, Datum" statt "Ort, den Datum"
- Mitteilung Sie-Stil: "Lieber/Liebe Herr/Frau X" statt "Sehr geehrte/r"
  (Abmahnungen bleiben förmlich, Du-Stil unverändert)
- abmahnung_bv: echter BV-Briefkopf (Logo vorlagen/logo_bv.jpg 35mm rechts +
  Organisations-Zeile, Kontakt-Block entfernt, Fußzeile mit BV-Kontaktdaten)
- render_docx.py: optionales logo_mm (quadratisches BV-Logo schmaler)

Betrifft nur künftig erzeugte Entwürfe; bestehende Postfach-Entwürfe unberührt.

Co-Authored-By: Claude Opus 4.8 (1M context) <noreply@anthropic.com>
</commit_message>
<xml_diff>
--- a/vorlagen/abmahnung_bv.docx
+++ b/vorlagen/abmahnung_bv.docx
@@ -17,9 +17,22 @@
     <w:p>
       <w:pPr>
         <w:spacing w:after="200"/>
+        <w:jc w:val="right"/>
       </w:pPr>
       <w:r>
         <w:t>{{ logo }}</w:t>
+      </w:r>
+    </w:p>
+    <w:p>
+      <w:pPr>
+        <w:jc w:val="right"/>
+      </w:pPr>
+      <w:r>
+        <w:rPr>
+          <w:color w:val="557F2D"/>
+          <w:sz w:val="13"/>
+        </w:rPr>
+        <w:t>ORGANISATION DER SIEDLER, EIGENHEIMER &amp; KLEINGÄRTNER</w:t>
       </w:r>
     </w:p>
     <w:p>
@@ -98,14 +111,6 @@
               <w:spacing w:after="0"/>
             </w:pPr>
             <w:r>
-              <w:t>{{ empf_anrede_zeile }}</w:t>
-            </w:r>
-          </w:p>
-          <w:p>
-            <w:pPr>
-              <w:spacing w:after="0"/>
-            </w:pPr>
-            <w:r>
               <w:t>{{ empf_name }}</w:t>
             </w:r>
           </w:p>
@@ -130,50 +135,7 @@
           <w:tcPr>
             <w:tcW w:type="dxa" w:w="3969"/>
           </w:tcPr>
-          <w:p>
-            <w:pPr>
-              <w:spacing w:after="0"/>
-            </w:pPr>
-            <w:r>
-              <w:rPr>
-                <w:sz w:val="18"/>
-              </w:rPr>
-              <w:t>Kontakt:</w:t>
-            </w:r>
-          </w:p>
-          <w:p>
-            <w:pPr>
-              <w:spacing w:after="0"/>
-            </w:pPr>
-            <w:r>
-              <w:rPr>
-                <w:sz w:val="18"/>
-              </w:rPr>
-              <w:t>{{ bv_name }}</w:t>
-            </w:r>
-          </w:p>
-          <w:p>
-            <w:pPr>
-              <w:spacing w:after="0"/>
-            </w:pPr>
-            <w:r>
-              <w:rPr>
-                <w:sz w:val="18"/>
-              </w:rPr>
-              <w:t>{{ bv_strasse }} · {{ bv_plz_ort }}</w:t>
-            </w:r>
-          </w:p>
-          <w:p>
-            <w:pPr>
-              <w:spacing w:after="0"/>
-            </w:pPr>
-            <w:r>
-              <w:rPr>
-                <w:sz w:val="18"/>
-              </w:rPr>
-              <w:t>{{ bv_email }}</w:t>
-            </w:r>
-          </w:p>
+          <w:p/>
         </w:tc>
       </w:tr>
     </w:tbl>
@@ -187,7 +149,7 @@
           <w:b w:val="0"/>
           <w:i w:val="0"/>
         </w:rPr>
-        <w:t>{{ ort }}, den {{ heute_datum }}</w:t>
+        <w:t>{{ ort }}, {{ heute_datum }}</w:t>
       </w:r>
     </w:p>
     <w:p>
@@ -442,6 +404,7 @@
       </w:r>
     </w:p>
     <w:sectPr>
+      <w:footerReference w:type="default" r:id="rId9"/>
       <w:pgSz w:w="11906" w:h="16838"/>
       <w:pgMar w:top="1134" w:right="1417" w:bottom="1134" w:left="1417" w:header="720" w:footer="720" w:gutter="0"/>
       <w:cols w:space="720"/>
@@ -449,6 +412,48 @@
     </w:sectPr>
   </w:body>
 </w:document>
+</file>
+
+<file path=word/footer1.xml><?xml version="1.0" encoding="utf-8"?>
+<w:ftr xmlns:m="http://schemas.openxmlformats.org/officeDocument/2006/math" xmlns:mc="http://schemas.openxmlformats.org/markup-compatibility/2006" xmlns:mo="http://schemas.microsoft.com/office/mac/office/2008/main" xmlns:mv="urn:schemas-microsoft-com:mac:vml" xmlns:o="urn:schemas-microsoft-com:office:office" xmlns:r="http://schemas.openxmlformats.org/officeDocument/2006/relationships" xmlns:v="urn:schemas-microsoft-com:vml" xmlns:w10="urn:schemas-microsoft-com:office:word" xmlns:w14="http://schemas.microsoft.com/office/word/2010/wordml" xmlns:w="http://schemas.openxmlformats.org/wordprocessingml/2006/main" xmlns:wne="http://schemas.microsoft.com/office/word/2006/wordml" xmlns:wp14="http://schemas.microsoft.com/office/word/2010/wordprocessingDrawing" xmlns:wp="http://schemas.openxmlformats.org/drawingml/2006/wordprocessingDrawing" xmlns:wpc="http://schemas.microsoft.com/office/word/2010/wordprocessingCanvas" xmlns:wpg="http://schemas.microsoft.com/office/word/2010/wordprocessingGroup" xmlns:wpi="http://schemas.microsoft.com/office/word/2010/wordprocessingInk" xmlns:wps="http://schemas.microsoft.com/office/word/2010/wordprocessingShape" mc:Ignorable="w14 wp14">
+  <w:p>
+    <w:pPr>
+      <w:pStyle w:val="Footer"/>
+      <w:jc w:val="center"/>
+    </w:pPr>
+    <w:r>
+      <w:rPr>
+        <w:color w:val="557F2D"/>
+        <w:sz w:val="13"/>
+      </w:rPr>
+      <w:t>Hedelfinger Str. 95 · 70327 Stuttgart · Tel: 0711 46 60 01 / 420 87 07 · Fax: 0711 489 29 61 · E-Mail: info@gartenfreunde-stuttgart.de</w:t>
+    </w:r>
+  </w:p>
+  <w:p>
+    <w:pPr>
+      <w:jc w:val="center"/>
+    </w:pPr>
+    <w:r>
+      <w:rPr>
+        <w:color w:val="557F2D"/>
+        <w:sz w:val="13"/>
+      </w:rPr>
+      <w:t>Bürozeiten: Mo–Do. 9:45–12:30 Uhr · Volksbank Stuttgart · DE82600901000423724002 · VOBADESS · Steuernr. 99015/22595</w:t>
+    </w:r>
+  </w:p>
+  <w:p>
+    <w:pPr>
+      <w:jc w:val="center"/>
+    </w:pPr>
+    <w:r>
+      <w:rPr>
+        <w:color w:val="557F2D"/>
+        <w:sz w:val="13"/>
+      </w:rPr>
+      <w:t>Vorstände: S. Metzger, S. Polinski, M. Zipperle, T. Kapitzki-Nagler, Dr. M. Ernst · Internet: www.gartenfreunde-stuttgart.de</w:t>
+    </w:r>
+  </w:p>
+</w:ftr>
 </file>
 
 <file path=word/numbering.xml><?xml version="1.0" encoding="utf-8"?>

</xml_diff>

<commit_message>
feat: Schreiben auf offiziellem Briefkopf + Vorstands-Stil, Beet-Ampel 2/3
- Mitteilung + Verein-Abmahnung auf offiziellem Vereins-Briefkopf (Logo/Fußzeile),
  BV-Abmahnung auf BV-Briefkopf (logo_bv.jpg 35mm + Fußzeile)
- 1. Abmahnung ohne Fotos (nur Text)
- Beet-Ampel: rot <2/3, orange 2/3–90%, grün ≥90% (constants BEET_AUSREICHEND/GUT);
  Gemüse wird ab 2/3 nicht mehr angemahnt (Ampel + Schreiben konsistent)
- Abmahn-Stil an Vorstands-Endfassungen angeglichen: Einleitung mit verstoss_arten
  + optional "wie bereits in den Vorjahren"; Abmahn-Grund mit einem §-Verweis;
  neuer Gemüse-Abmahntext (§1, Obst+Gemüse je 1/6, Sofort-Ziel 2/3 diese Saison);
  Gemüse prominent nur wenn Hauptthema, sonst Schluss-Hinweis (gemuese_schluss)
- Signatur mit 1. Vorsitzende; Bausteine G04/S01/B12 an Endfassungen angehoben

Co-Authored-By: Claude Opus 4.8 (1M context) <noreply@anthropic.com>
</commit_message>
<xml_diff>
--- a/vorlagen/abmahnung_bv.docx
+++ b/vorlagen/abmahnung_bv.docx
@@ -380,6 +380,33 @@
       </w:r>
     </w:p>
     <w:p>
+      <w:r>
+        <w:rPr>
+          <w:rFonts w:ascii="Arial" w:hAnsi="Arial"/>
+          <w:sz w:val="22"/>
+        </w:rPr>
+        <w:t>{%p if gemuese_schluss %}</w:t>
+      </w:r>
+    </w:p>
+    <w:p>
+      <w:r>
+        <w:rPr>
+          <w:rFonts w:ascii="Arial" w:hAnsi="Arial"/>
+          <w:sz w:val="22"/>
+        </w:rPr>
+        <w:t>{{ gemuese_schluss }}</w:t>
+      </w:r>
+    </w:p>
+    <w:p>
+      <w:r>
+        <w:rPr>
+          <w:rFonts w:ascii="Arial" w:hAnsi="Arial"/>
+          <w:sz w:val="22"/>
+        </w:rPr>
+        <w:t>{%p endif %}</w:t>
+      </w:r>
+    </w:p>
+    <w:p>
       <w:pPr>
         <w:spacing w:after="280" w:before="0"/>
       </w:pPr>

</xml_diff>

<commit_message>
fix: Schreiben-Feinschliff — Beetgröße-Platzhalter, Absätze/Nummerierung, 2. Abm. ohne Fotos, Status-Anzeige
- Gemüse ohne erfasste Beetgröße (null oder 0): "(BEETGRÖSSE UNKLAR – noch zu
  ermitteln)" statt "0 m²" (Mitteilung + beide Abmahnungen)
- Mitteilung/Abmahnung: Absatz-Abstände (Leerzeilen) zwischen Blöcken und vor
  jeder Listenposition; echte Word-Nummerierung (decimal numId 99) statt "1." als Text
- 2. Abmahnung (BV) jetzt ebenfalls ohne Fotos (mitFotos nur für Mitteilung);
  bilder-Loop aus abmahnung_bv.docx entfernt
- Parzellen-Stammdaten: Formular-key erzwingt Remount nach Server-Action
  (React-19-Form-Reset zeigte nach dem Speichern den Alt-Status statt gekündigt)

Co-Authored-By: Claude Opus 4.8 (1M context) <noreply@anthropic.com>
</commit_message>
<xml_diff>
--- a/vorlagen/abmahnung_bv.docx
+++ b/vorlagen/abmahnung_bv.docx
@@ -279,44 +279,20 @@
     </w:p>
     <w:p>
       <w:pPr>
-        <w:spacing w:after="120"/>
+        <w:spacing w:after="220"/>
         <w:ind w:left="340"/>
-      </w:pPr>
-      <w:r>
-        <w:t>{{ loop.index }}. {{ b.text }}{% if b.foto and not b.bilder %} (siehe Foto {{ b.foto }}){% endif %}{% if b.frist %} – Frist: {{ b.frist }}{% endif %}</w:t>
-      </w:r>
-    </w:p>
-    <w:p>
-      <w:pPr>
-        <w:spacing w:after="0" w:before="0"/>
+        <w:numPr>
+          <w:ilvl w:val="0"/>
+          <w:numId w:val="99"/>
+        </w:numPr>
       </w:pPr>
       <w:r>
         <w:rPr>
+          <w:rFonts w:ascii="Arial" w:hAnsi="Arial"/>
           <w:b w:val="0"/>
-          <w:i w:val="0"/>
+          <w:sz w:val="22"/>
         </w:rPr>
-        <w:t>{%p if b.bilder %}</w:t>
-      </w:r>
-    </w:p>
-    <w:p>
-      <w:pPr>
-        <w:spacing w:after="160"/>
-        <w:ind w:left="340"/>
-      </w:pPr>
-      <w:r>
-        <w:t>{% for img in b.bilder %}{{ img }} {% endfor %}</w:t>
-      </w:r>
-    </w:p>
-    <w:p>
-      <w:pPr>
-        <w:spacing w:after="0" w:before="0"/>
-      </w:pPr>
-      <w:r>
-        <w:rPr>
-          <w:b w:val="0"/>
-          <w:i w:val="0"/>
-        </w:rPr>
-        <w:t>{%p endif %}</w:t>
+        <w:t>{{ b.text }}{% if b.frist %} – Frist: {{ b.frist }}{% endif %}</w:t>
       </w:r>
     </w:p>
     <w:p>
@@ -656,6 +632,18 @@
       </w:rPr>
     </w:lvl>
   </w:abstractNum>
+  <w:abstractNum w:abstractNumId="99">
+    <w:multiLevelType w:val="singleLevel"/>
+    <w:lvl w:ilvl="0">
+      <w:start w:val="1"/>
+      <w:numFmt w:val="decimal"/>
+      <w:lvlText w:val="%1."/>
+      <w:lvlJc w:val="left"/>
+      <w:pPr>
+        <w:ind w:left="425" w:hanging="425"/>
+      </w:pPr>
+    </w:lvl>
+  </w:abstractNum>
   <w:num w:numId="1">
     <w:abstractNumId w:val="8"/>
   </w:num>
@@ -682,6 +670,9 @@
   </w:num>
   <w:num w:numId="9">
     <w:abstractNumId w:val="0"/>
+  </w:num>
+  <w:num w:numId="99">
+    <w:abstractNumId w:val="99"/>
   </w:num>
 </w:numbering>
 </file>

</xml_diff>